<commit_message>
Replace static contents with a native Word TOC
</commit_message>
<xml_diff>
--- a/DentalExplain Report.docx
+++ b/DentalExplain Report.docx
@@ -223,6 +223,534 @@
         <w:jc w:val="center"/>
       </w:pPr>
     </w:p>
+    <w:sdt>
+      <w:sdtPr>
+        <w:alias w:val="Table of Contents"/>
+        <w:id w:val="19860123"/>
+        <w:docPartObj>
+          <w:docPartGallery w:val="Table of Contents"/>
+          <w:docPartUnique/>
+        </w:docPartObj>
+      </w:sdtPr>
+      <w:sdtContent>
+        <w:p>
+          <w:pPr>
+            <w:pStyle w:val="TOCHeading"/>
+            <w:keepNext/>
+            <w:pageBreakBefore/>
+            <w:spacing w:after="140"/>
+          </w:pPr>
+          <w:r>
+            <w:lastRenderedPageBreak/>
+            <w:t>Contents</w:t>
+          </w:r>
+        </w:p>
+        <w:p>
+          <w:pPr>
+            <w:pStyle w:val="TOC1"/>
+            <w:tabs>
+              <w:tab w:val="right" w:leader="dot" w:pos="9360"/>
+            </w:tabs>
+            <w:spacing w:after="155"/>
+          </w:pPr>
+          <w:r>
+            <w:fldChar w:fldCharType="begin"/>
+          </w:r>
+          <w:r>
+            <w:instrText xml:space="preserve"> TOC \o "1-1" \h \z </w:instrText>
+          </w:r>
+          <w:r>
+            <w:fldChar w:fldCharType="separate"/>
+          </w:r>
+          <w:hyperlink w:anchor="_TocDentalExplain1" w:history="1">
+            <w:r>
+              <w:rPr>
+                <w:rFonts w:cs="Times New Roman"/>
+              </w:rPr>
+              <w:t>1 Introduction</w:t>
+            </w:r>
+          </w:hyperlink>
+          <w:r>
+            <w:rPr>
+              <w:rFonts w:cs="Times New Roman"/>
+            </w:rPr>
+            <w:tab/>
+          </w:r>
+          <w:r>
+            <w:fldChar w:fldCharType="begin"/>
+          </w:r>
+          <w:r>
+            <w:instrText xml:space="preserve"> PAGEREF _TocDentalExplain1 \h </w:instrText>
+          </w:r>
+          <w:r>
+            <w:fldChar w:fldCharType="separate"/>
+          </w:r>
+          <w:r>
+            <w:rPr>
+              <w:rFonts w:cs="Times New Roman"/>
+            </w:rPr>
+            <w:t>3</w:t>
+          </w:r>
+          <w:r>
+            <w:fldChar w:fldCharType="end"/>
+          </w:r>
+        </w:p>
+        <w:p>
+          <w:pPr>
+            <w:pStyle w:val="TOC1"/>
+            <w:tabs>
+              <w:tab w:val="right" w:leader="dot" w:pos="9360"/>
+            </w:tabs>
+            <w:spacing w:after="155"/>
+          </w:pPr>
+          <w:hyperlink w:anchor="_TocDentalExplain2" w:history="1">
+            <w:r>
+              <w:rPr>
+                <w:rFonts w:cs="Times New Roman"/>
+              </w:rPr>
+              <w:t>2 Domain Definition and Scope</w:t>
+            </w:r>
+          </w:hyperlink>
+          <w:r>
+            <w:rPr>
+              <w:rFonts w:cs="Times New Roman"/>
+            </w:rPr>
+            <w:tab/>
+          </w:r>
+          <w:r>
+            <w:fldChar w:fldCharType="begin"/>
+          </w:r>
+          <w:r>
+            <w:instrText xml:space="preserve"> PAGEREF _TocDentalExplain2 \h </w:instrText>
+          </w:r>
+          <w:r>
+            <w:fldChar w:fldCharType="separate"/>
+          </w:r>
+          <w:r>
+            <w:rPr>
+              <w:rFonts w:cs="Times New Roman"/>
+            </w:rPr>
+            <w:t>4</w:t>
+          </w:r>
+          <w:r>
+            <w:fldChar w:fldCharType="end"/>
+          </w:r>
+        </w:p>
+        <w:p>
+          <w:pPr>
+            <w:pStyle w:val="TOC1"/>
+            <w:tabs>
+              <w:tab w:val="right" w:leader="dot" w:pos="9360"/>
+            </w:tabs>
+            <w:spacing w:after="155"/>
+          </w:pPr>
+          <w:hyperlink w:anchor="_TocDentalExplain3" w:history="1">
+            <w:r>
+              <w:rPr>
+                <w:rFonts w:cs="Times New Roman"/>
+              </w:rPr>
+              <w:t>3 Knowledge Acquisition</w:t>
+            </w:r>
+          </w:hyperlink>
+          <w:r>
+            <w:rPr>
+              <w:rFonts w:cs="Times New Roman"/>
+            </w:rPr>
+            <w:tab/>
+          </w:r>
+          <w:r>
+            <w:fldChar w:fldCharType="begin"/>
+          </w:r>
+          <w:r>
+            <w:instrText xml:space="preserve"> PAGEREF _TocDentalExplain3 \h </w:instrText>
+          </w:r>
+          <w:r>
+            <w:fldChar w:fldCharType="separate"/>
+          </w:r>
+          <w:r>
+            <w:rPr>
+              <w:rFonts w:cs="Times New Roman"/>
+            </w:rPr>
+            <w:t>5</w:t>
+          </w:r>
+          <w:r>
+            <w:fldChar w:fldCharType="end"/>
+          </w:r>
+        </w:p>
+        <w:p>
+          <w:pPr>
+            <w:pStyle w:val="TOC1"/>
+            <w:tabs>
+              <w:tab w:val="right" w:leader="dot" w:pos="9360"/>
+            </w:tabs>
+            <w:spacing w:after="155"/>
+          </w:pPr>
+          <w:hyperlink w:anchor="_TocDentalExplain4" w:history="1">
+            <w:r>
+              <w:rPr>
+                <w:rFonts w:cs="Times New Roman"/>
+              </w:rPr>
+              <w:t>4 Expert System Architecture</w:t>
+            </w:r>
+          </w:hyperlink>
+          <w:r>
+            <w:rPr>
+              <w:rFonts w:cs="Times New Roman"/>
+            </w:rPr>
+            <w:tab/>
+          </w:r>
+          <w:r>
+            <w:fldChar w:fldCharType="begin"/>
+          </w:r>
+          <w:r>
+            <w:instrText xml:space="preserve"> PAGEREF _TocDentalExplain4 \h </w:instrText>
+          </w:r>
+          <w:r>
+            <w:fldChar w:fldCharType="separate"/>
+          </w:r>
+          <w:r>
+            <w:rPr>
+              <w:rFonts w:cs="Times New Roman"/>
+            </w:rPr>
+            <w:t>6</w:t>
+          </w:r>
+          <w:r>
+            <w:fldChar w:fldCharType="end"/>
+          </w:r>
+        </w:p>
+        <w:p>
+          <w:pPr>
+            <w:pStyle w:val="TOC1"/>
+            <w:tabs>
+              <w:tab w:val="right" w:leader="dot" w:pos="9360"/>
+            </w:tabs>
+            <w:spacing w:after="155"/>
+          </w:pPr>
+          <w:hyperlink w:anchor="_TocDentalExplain5" w:history="1">
+            <w:r>
+              <w:rPr>
+                <w:rFonts w:cs="Times New Roman"/>
+              </w:rPr>
+              <w:t>5 Knowledge Representation</w:t>
+            </w:r>
+          </w:hyperlink>
+          <w:r>
+            <w:rPr>
+              <w:rFonts w:cs="Times New Roman"/>
+            </w:rPr>
+            <w:tab/>
+          </w:r>
+          <w:r>
+            <w:fldChar w:fldCharType="begin"/>
+          </w:r>
+          <w:r>
+            <w:instrText xml:space="preserve"> PAGEREF _TocDentalExplain5 \h </w:instrText>
+          </w:r>
+          <w:r>
+            <w:fldChar w:fldCharType="separate"/>
+          </w:r>
+          <w:r>
+            <w:rPr>
+              <w:rFonts w:cs="Times New Roman"/>
+            </w:rPr>
+            <w:t>8</w:t>
+          </w:r>
+          <w:r>
+            <w:fldChar w:fldCharType="end"/>
+          </w:r>
+        </w:p>
+        <w:p>
+          <w:pPr>
+            <w:pStyle w:val="TOC1"/>
+            <w:tabs>
+              <w:tab w:val="right" w:leader="dot" w:pos="9360"/>
+            </w:tabs>
+            <w:spacing w:after="155"/>
+          </w:pPr>
+          <w:hyperlink w:anchor="_TocDentalExplain6" w:history="1">
+            <w:r>
+              <w:rPr>
+                <w:rFonts w:cs="Times New Roman"/>
+              </w:rPr>
+              <w:t>6 Inference Method</w:t>
+            </w:r>
+          </w:hyperlink>
+          <w:r>
+            <w:rPr>
+              <w:rFonts w:cs="Times New Roman"/>
+            </w:rPr>
+            <w:tab/>
+          </w:r>
+          <w:r>
+            <w:fldChar w:fldCharType="begin"/>
+          </w:r>
+          <w:r>
+            <w:instrText xml:space="preserve"> PAGEREF _TocDentalExplain6 \h </w:instrText>
+          </w:r>
+          <w:r>
+            <w:fldChar w:fldCharType="separate"/>
+          </w:r>
+          <w:r>
+            <w:rPr>
+              <w:rFonts w:cs="Times New Roman"/>
+            </w:rPr>
+            <w:t>9</w:t>
+          </w:r>
+          <w:r>
+            <w:fldChar w:fldCharType="end"/>
+          </w:r>
+        </w:p>
+        <w:p>
+          <w:pPr>
+            <w:pStyle w:val="TOC1"/>
+            <w:tabs>
+              <w:tab w:val="right" w:leader="dot" w:pos="9360"/>
+            </w:tabs>
+            <w:spacing w:after="155"/>
+          </w:pPr>
+          <w:hyperlink w:anchor="_TocDentalExplain7" w:history="1">
+            <w:r>
+              <w:rPr>
+                <w:rFonts w:cs="Times New Roman"/>
+              </w:rPr>
+              <w:t>7 System Design and Implementation</w:t>
+            </w:r>
+          </w:hyperlink>
+          <w:r>
+            <w:rPr>
+              <w:rFonts w:cs="Times New Roman"/>
+            </w:rPr>
+            <w:tab/>
+          </w:r>
+          <w:r>
+            <w:fldChar w:fldCharType="begin"/>
+          </w:r>
+          <w:r>
+            <w:instrText xml:space="preserve"> PAGEREF _TocDentalExplain7 \h </w:instrText>
+          </w:r>
+          <w:r>
+            <w:fldChar w:fldCharType="separate"/>
+          </w:r>
+          <w:r>
+            <w:rPr>
+              <w:rFonts w:cs="Times New Roman"/>
+            </w:rPr>
+            <w:t>10</w:t>
+          </w:r>
+          <w:r>
+            <w:fldChar w:fldCharType="end"/>
+          </w:r>
+        </w:p>
+        <w:p>
+          <w:pPr>
+            <w:pStyle w:val="TOC1"/>
+            <w:tabs>
+              <w:tab w:val="right" w:leader="dot" w:pos="9360"/>
+            </w:tabs>
+            <w:spacing w:after="155"/>
+          </w:pPr>
+          <w:hyperlink w:anchor="_TocDentalExplain8" w:history="1">
+            <w:r>
+              <w:rPr>
+                <w:rFonts w:cs="Times New Roman"/>
+              </w:rPr>
+              <w:t>8 Testing and Evaluation</w:t>
+            </w:r>
+          </w:hyperlink>
+          <w:r>
+            <w:rPr>
+              <w:rFonts w:cs="Times New Roman"/>
+            </w:rPr>
+            <w:tab/>
+          </w:r>
+          <w:r>
+            <w:fldChar w:fldCharType="begin"/>
+          </w:r>
+          <w:r>
+            <w:instrText xml:space="preserve"> PAGEREF _TocDentalExplain8 \h </w:instrText>
+          </w:r>
+          <w:r>
+            <w:fldChar w:fldCharType="separate"/>
+          </w:r>
+          <w:r>
+            <w:rPr>
+              <w:rFonts w:cs="Times New Roman"/>
+            </w:rPr>
+            <w:t>15</w:t>
+          </w:r>
+          <w:r>
+            <w:fldChar w:fldCharType="end"/>
+          </w:r>
+        </w:p>
+        <w:p>
+          <w:pPr>
+            <w:pStyle w:val="TOC1"/>
+            <w:tabs>
+              <w:tab w:val="right" w:leader="dot" w:pos="9360"/>
+            </w:tabs>
+            <w:spacing w:after="155"/>
+          </w:pPr>
+          <w:hyperlink w:anchor="_TocDentalExplain9" w:history="1">
+            <w:r>
+              <w:rPr>
+                <w:rFonts w:cs="Times New Roman"/>
+              </w:rPr>
+              <w:t>References</w:t>
+            </w:r>
+          </w:hyperlink>
+          <w:r>
+            <w:rPr>
+              <w:rFonts w:cs="Times New Roman"/>
+            </w:rPr>
+            <w:tab/>
+          </w:r>
+          <w:r>
+            <w:fldChar w:fldCharType="begin"/>
+          </w:r>
+          <w:r>
+            <w:instrText xml:space="preserve"> PAGEREF _TocDentalExplain9 \h </w:instrText>
+          </w:r>
+          <w:r>
+            <w:fldChar w:fldCharType="separate"/>
+          </w:r>
+          <w:r>
+            <w:rPr>
+              <w:rFonts w:cs="Times New Roman"/>
+            </w:rPr>
+            <w:t>17</w:t>
+          </w:r>
+          <w:r>
+            <w:fldChar w:fldCharType="end"/>
+          </w:r>
+        </w:p>
+        <w:p>
+          <w:pPr>
+            <w:pStyle w:val="TOC1"/>
+            <w:tabs>
+              <w:tab w:val="right" w:leader="dot" w:pos="9360"/>
+            </w:tabs>
+            <w:spacing w:after="155"/>
+          </w:pPr>
+          <w:hyperlink w:anchor="_TocDentalExplain10" w:history="1">
+            <w:r>
+              <w:rPr>
+                <w:rFonts w:cs="Times New Roman"/>
+              </w:rPr>
+              <w:t>Appendix A User Manual</w:t>
+            </w:r>
+          </w:hyperlink>
+          <w:r>
+            <w:rPr>
+              <w:rFonts w:cs="Times New Roman"/>
+            </w:rPr>
+            <w:tab/>
+          </w:r>
+          <w:r>
+            <w:fldChar w:fldCharType="begin"/>
+          </w:r>
+          <w:r>
+            <w:instrText xml:space="preserve"> PAGEREF _TocDentalExplain10 \h </w:instrText>
+          </w:r>
+          <w:r>
+            <w:fldChar w:fldCharType="separate"/>
+          </w:r>
+          <w:r>
+            <w:rPr>
+              <w:rFonts w:cs="Times New Roman"/>
+            </w:rPr>
+            <w:t>18</w:t>
+          </w:r>
+          <w:r>
+            <w:fldChar w:fldCharType="end"/>
+          </w:r>
+        </w:p>
+        <w:p>
+          <w:pPr>
+            <w:pStyle w:val="TOC1"/>
+            <w:tabs>
+              <w:tab w:val="right" w:leader="dot" w:pos="9360"/>
+            </w:tabs>
+            <w:spacing w:after="155"/>
+          </w:pPr>
+          <w:hyperlink w:anchor="_TocDentalExplain11" w:history="1">
+            <w:r>
+              <w:rPr>
+                <w:rFonts w:cs="Times New Roman"/>
+              </w:rPr>
+              <w:t>Appendix B Human Expert Questionnaire</w:t>
+            </w:r>
+          </w:hyperlink>
+          <w:r>
+            <w:rPr>
+              <w:rFonts w:cs="Times New Roman"/>
+            </w:rPr>
+            <w:tab/>
+          </w:r>
+          <w:r>
+            <w:fldChar w:fldCharType="begin"/>
+          </w:r>
+          <w:r>
+            <w:instrText xml:space="preserve"> PAGEREF _TocDentalExplain11 \h </w:instrText>
+          </w:r>
+          <w:r>
+            <w:fldChar w:fldCharType="separate"/>
+          </w:r>
+          <w:r>
+            <w:rPr>
+              <w:rFonts w:cs="Times New Roman"/>
+            </w:rPr>
+            <w:t>20</w:t>
+          </w:r>
+          <w:r>
+            <w:fldChar w:fldCharType="end"/>
+          </w:r>
+        </w:p>
+        <w:p>
+          <w:pPr>
+            <w:pStyle w:val="TOC1"/>
+            <w:tabs>
+              <w:tab w:val="right" w:leader="dot" w:pos="9360"/>
+            </w:tabs>
+            <w:spacing w:after="155"/>
+          </w:pPr>
+          <w:hyperlink w:anchor="_TocDentalExplain12" w:history="1">
+            <w:r>
+              <w:rPr>
+                <w:rFonts w:cs="Times New Roman"/>
+              </w:rPr>
+              <w:t>Appendix C Knowledge Catalogue</w:t>
+            </w:r>
+          </w:hyperlink>
+          <w:r>
+            <w:rPr>
+              <w:rFonts w:cs="Times New Roman"/>
+            </w:rPr>
+            <w:tab/>
+          </w:r>
+          <w:r>
+            <w:fldChar w:fldCharType="begin"/>
+          </w:r>
+          <w:r>
+            <w:instrText xml:space="preserve"> PAGEREF _TocDentalExplain12 \h </w:instrText>
+          </w:r>
+          <w:r>
+            <w:fldChar w:fldCharType="separate"/>
+          </w:r>
+          <w:r>
+            <w:rPr>
+              <w:rFonts w:cs="Times New Roman"/>
+            </w:rPr>
+            <w:t>22</w:t>
+          </w:r>
+          <w:r>
+            <w:fldChar w:fldCharType="end"/>
+          </w:r>
+          <w:r>
+            <w:fldChar w:fldCharType="end"/>
+          </w:r>
+        </w:p>
+      </w:sdtContent>
+    </w:sdt>
     <w:p>
       <w:pPr>
         <w:pStyle w:val="Heading1"/>
@@ -230,261 +758,89 @@
         <w:pageBreakBefore/>
         <w:spacing w:after="140"/>
       </w:pPr>
+      <w:bookmarkStart w:id="1" w:name="_TocDentalExplain1"/>
       <w:r>
         <w:lastRenderedPageBreak/>
-        <w:t>Contents</w:t>
-      </w:r>
-    </w:p>
-    <w:p>
-      <w:pPr>
-        <w:tabs>
-          <w:tab w:val="right" w:leader="dot" w:pos="9360"/>
-        </w:tabs>
-        <w:spacing w:after="155"/>
-      </w:pPr>
-      <w:r>
-        <w:rPr>
-          <w:rFonts w:cs="Times New Roman"/>
-        </w:rPr>
         <w:t>1 Introduction</w:t>
       </w:r>
-      <w:r>
-        <w:rPr>
-          <w:rFonts w:cs="Times New Roman"/>
-        </w:rPr>
-        <w:tab/>
-        <w:t>3</w:t>
-      </w:r>
-    </w:p>
-    <w:p>
-      <w:pPr>
-        <w:tabs>
-          <w:tab w:val="right" w:leader="dot" w:pos="9360"/>
-        </w:tabs>
-        <w:spacing w:after="155"/>
-      </w:pPr>
-      <w:r>
-        <w:rPr>
-          <w:rFonts w:cs="Times New Roman"/>
-        </w:rPr>
-        <w:t>2 Domain Definition and Scope</w:t>
-      </w:r>
-      <w:r>
-        <w:rPr>
-          <w:rFonts w:cs="Times New Roman"/>
-        </w:rPr>
-        <w:tab/>
-        <w:t>4</w:t>
-      </w:r>
-    </w:p>
-    <w:p>
-      <w:pPr>
-        <w:tabs>
-          <w:tab w:val="right" w:leader="dot" w:pos="9360"/>
-        </w:tabs>
-        <w:spacing w:after="155"/>
-      </w:pPr>
-      <w:r>
-        <w:rPr>
-          <w:rFonts w:cs="Times New Roman"/>
-        </w:rPr>
-        <w:t>3 Knowledge Acquisition</w:t>
-      </w:r>
-      <w:r>
-        <w:rPr>
-          <w:rFonts w:cs="Times New Roman"/>
-        </w:rPr>
-        <w:tab/>
-        <w:t>5</w:t>
-      </w:r>
-    </w:p>
-    <w:p>
-      <w:pPr>
-        <w:tabs>
-          <w:tab w:val="right" w:leader="dot" w:pos="9360"/>
-        </w:tabs>
-        <w:spacing w:after="155"/>
-      </w:pPr>
-      <w:r>
-        <w:rPr>
-          <w:rFonts w:cs="Times New Roman"/>
-        </w:rPr>
-        <w:t>4 Expert System Architecture</w:t>
-      </w:r>
-      <w:r>
-        <w:rPr>
-          <w:rFonts w:cs="Times New Roman"/>
-        </w:rPr>
-        <w:tab/>
-        <w:t>6</w:t>
-      </w:r>
-    </w:p>
-    <w:p>
-      <w:pPr>
-        <w:tabs>
-          <w:tab w:val="right" w:leader="dot" w:pos="9360"/>
-        </w:tabs>
-        <w:spacing w:after="155"/>
-      </w:pPr>
-      <w:r>
-        <w:rPr>
-          <w:rFonts w:cs="Times New Roman"/>
-        </w:rPr>
-        <w:t>5 Knowledge Representation</w:t>
-      </w:r>
-      <w:r>
-        <w:rPr>
-          <w:rFonts w:cs="Times New Roman"/>
-        </w:rPr>
-        <w:tab/>
-        <w:t>8</w:t>
-      </w:r>
-    </w:p>
-    <w:p>
-      <w:pPr>
-        <w:tabs>
-          <w:tab w:val="right" w:leader="dot" w:pos="9360"/>
-        </w:tabs>
-        <w:spacing w:after="155"/>
-      </w:pPr>
-      <w:r>
-        <w:rPr>
-          <w:rFonts w:cs="Times New Roman"/>
-        </w:rPr>
-        <w:t>6 Inference Method</w:t>
-      </w:r>
-      <w:r>
-        <w:rPr>
-          <w:rFonts w:cs="Times New Roman"/>
-        </w:rPr>
-        <w:tab/>
-        <w:t>9</w:t>
-      </w:r>
-    </w:p>
-    <w:p>
-      <w:pPr>
-        <w:tabs>
-          <w:tab w:val="right" w:leader="dot" w:pos="9360"/>
-        </w:tabs>
-        <w:spacing w:after="155"/>
-      </w:pPr>
-      <w:r>
-        <w:rPr>
-          <w:rFonts w:cs="Times New Roman"/>
-        </w:rPr>
-        <w:t>7 System Design and Implementation</w:t>
-      </w:r>
-      <w:r>
-        <w:rPr>
-          <w:rFonts w:cs="Times New Roman"/>
-        </w:rPr>
-        <w:tab/>
-        <w:t>10</w:t>
-      </w:r>
-    </w:p>
-    <w:p>
-      <w:pPr>
-        <w:tabs>
-          <w:tab w:val="right" w:leader="dot" w:pos="9360"/>
-        </w:tabs>
-        <w:spacing w:after="155"/>
-      </w:pPr>
-      <w:r>
-        <w:rPr>
-          <w:rFonts w:cs="Times New Roman"/>
-        </w:rPr>
-        <w:t>8 Testing and Evaluation</w:t>
-      </w:r>
-      <w:r>
-        <w:rPr>
-          <w:rFonts w:cs="Times New Roman"/>
-        </w:rPr>
-        <w:tab/>
-        <w:t>15</w:t>
-      </w:r>
-    </w:p>
-    <w:p>
-      <w:pPr>
-        <w:tabs>
-          <w:tab w:val="right" w:leader="dot" w:pos="9360"/>
-        </w:tabs>
-        <w:spacing w:after="155"/>
-      </w:pPr>
-      <w:r>
-        <w:rPr>
-          <w:rFonts w:cs="Times New Roman"/>
-        </w:rPr>
-        <w:t>References</w:t>
-      </w:r>
-      <w:r>
-        <w:rPr>
-          <w:rFonts w:cs="Times New Roman"/>
-        </w:rPr>
-        <w:tab/>
-        <w:t>17</w:t>
-      </w:r>
-    </w:p>
-    <w:p>
-      <w:pPr>
-        <w:tabs>
-          <w:tab w:val="right" w:leader="dot" w:pos="9360"/>
-        </w:tabs>
-        <w:spacing w:after="155"/>
-      </w:pPr>
-      <w:r>
-        <w:rPr>
-          <w:rFonts w:cs="Times New Roman"/>
-        </w:rPr>
-        <w:t>Appendix A User Manual</w:t>
-      </w:r>
-      <w:r>
-        <w:rPr>
-          <w:rFonts w:cs="Times New Roman"/>
-        </w:rPr>
-        <w:tab/>
-        <w:t>18</w:t>
-      </w:r>
-    </w:p>
-    <w:p>
-      <w:pPr>
-        <w:tabs>
-          <w:tab w:val="right" w:leader="dot" w:pos="9360"/>
-        </w:tabs>
-        <w:spacing w:after="155"/>
-      </w:pPr>
-      <w:r>
-        <w:rPr>
-          <w:rFonts w:cs="Times New Roman"/>
-        </w:rPr>
-        <w:t>Appendix B Human Expert Questionnaire</w:t>
-      </w:r>
-      <w:r>
-        <w:rPr>
-          <w:rFonts w:cs="Times New Roman"/>
-        </w:rPr>
-        <w:tab/>
-        <w:t>20</w:t>
-      </w:r>
-    </w:p>
-    <w:p>
-      <w:pPr>
-        <w:tabs>
-          <w:tab w:val="right" w:leader="dot" w:pos="9360"/>
-        </w:tabs>
-        <w:spacing w:after="155"/>
-      </w:pPr>
-      <w:r>
-        <w:rPr>
-          <w:rFonts w:cs="Times New Roman"/>
-        </w:rPr>
-        <w:t>Appendix C Knowledge Catalogue</w:t>
-      </w:r>
-      <w:r>
-        <w:rPr>
-          <w:rFonts w:cs="Times New Roman"/>
-        </w:rPr>
-        <w:tab/>
-        <w:t>22</w:t>
+      <w:bookmarkEnd w:id="1"/>
+    </w:p>
+    <w:p>
+      <w:pPr>
+        <w:pStyle w:val="Heading2"/>
+        <w:keepNext/>
+        <w:spacing w:before="220" w:after="140"/>
+      </w:pPr>
+      <w:r>
+        <w:t>1.1 Background</w:t>
+      </w:r>
+    </w:p>
+    <w:p>
+      <w:pPr>
+        <w:spacing w:line="360" w:lineRule="auto"/>
+        <w:ind w:firstLine="720"/>
+        <w:jc w:val="both"/>
+        <w:rPr>
+          <w:rFonts w:cs="Times New Roman"/>
+        </w:rPr>
+      </w:pPr>
+      <w:r>
+        <w:rPr>
+          <w:rFonts w:cs="Times New Roman"/>
+        </w:rPr>
+        <w:t>An expert system represents a specific area of knowledge as reusable facts and rules and applies an inference procedure to a supplied case. DentalExplain uses this approach for a defined set of dental presentations. Rather than accepting unstructured descriptions, it collects reported symptoms and examination findings through predefined controls, then evaluates explicit production rules.</w:t>
+      </w:r>
+    </w:p>
+    <w:p>
+      <w:pPr>
+        <w:spacing w:line="360" w:lineRule="auto"/>
+        <w:ind w:firstLine="720"/>
+        <w:jc w:val="both"/>
+        <w:rPr>
+          <w:rFonts w:cs="Times New Roman"/>
+        </w:rPr>
+      </w:pPr>
+      <w:r>
+        <w:rPr>
+          <w:rFonts w:cs="Times New Roman"/>
+        </w:rPr>
+        <w:t>Dental symptoms can overlap, while a condition such as early caries may be present without reported pain [1]. A useful consultation therefore needs both symptom information and objective findings. DentalExplain keeps these groups separate and retains basic caries and periodontal observations even when the user reports no pain or gum symptoms.</w:t>
+      </w:r>
+    </w:p>
+    <w:p>
+      <w:pPr>
+        <w:pStyle w:val="Heading2"/>
+        <w:keepNext/>
+        <w:spacing w:before="220" w:after="140"/>
+      </w:pPr>
+      <w:r>
+        <w:t>1.2 Problem statement</w:t>
+      </w:r>
+    </w:p>
+    <w:p>
+      <w:pPr>
+        <w:spacing w:line="360" w:lineRule="auto"/>
+        <w:ind w:firstLine="720"/>
+        <w:jc w:val="both"/>
+      </w:pPr>
+      <w:r>
+        <w:rPr>
+          <w:rFonts w:cs="Times New Roman"/>
+        </w:rPr>
+        <w:t>The problem addressed is how to provide a consistent, runnable expert-system consultation for five common dental conditions without ambiguous free-text inputs or an unnecessarily long questionnaire. The system must preserve uncertainty, identify missing or conflicting information, and evaluate evidence without requiring the user to select a diagnosis in advance.</w:t>
+      </w:r>
+    </w:p>
+    <w:p>
+      <w:pPr>
+        <w:spacing w:line="360" w:lineRule="auto"/>
+        <w:ind w:firstLine="720"/>
+        <w:jc w:val="both"/>
+      </w:pPr>
+      <w:r>
+        <w:rPr>
+          <w:rFonts w:cs="Times New Roman"/>
+        </w:rPr>
+        <w:t>DentalExplain addresses this problem through a shared Prolog question catalogue, adaptive routing and forward fixed-point reasoning. Its outputs are supported candidates and assessment statuses. It does not make an autonomous clinical diagnosis. The intended user is a dentist who enters findings obtained and interpreted outside the application.</w:t>
       </w:r>
     </w:p>
     <w:p>
@@ -494,10 +850,12 @@
         <w:pageBreakBefore/>
         <w:spacing w:after="140"/>
       </w:pPr>
+      <w:bookmarkStart w:id="2" w:name="_TocDentalExplain2"/>
       <w:r>
         <w:lastRenderedPageBreak/>
-        <w:t>1 Introduction</w:t>
-      </w:r>
+        <w:t>2 Domain Definition and Scope</w:t>
+      </w:r>
+      <w:bookmarkEnd w:id="2"/>
     </w:p>
     <w:p>
       <w:pPr>
@@ -506,7 +864,7 @@
         <w:spacing w:before="220" w:after="140"/>
       </w:pPr>
       <w:r>
-        <w:t>1.1 Background</w:t>
+        <w:t>2.1 Specific domain</w:t>
       </w:r>
     </w:p>
     <w:p>
@@ -514,15 +872,12 @@
         <w:spacing w:line="360" w:lineRule="auto"/>
         <w:ind w:firstLine="720"/>
         <w:jc w:val="both"/>
-        <w:rPr>
-          <w:rFonts w:cs="Times New Roman"/>
-        </w:rPr>
-      </w:pPr>
-      <w:r>
-        <w:rPr>
-          <w:rFonts w:cs="Times New Roman"/>
-        </w:rPr>
-        <w:t>An expert system represents a specific area of knowledge as reusable facts and rules and applies an inference procedure to a supplied case. DentalExplain uses this approach for a defined set of dental presentations. Rather than accepting unstructured descriptions, it collects reported symptoms and examination findings through predefined controls, then evaluates explicit production rules.</w:t>
+      </w:pPr>
+      <w:r>
+        <w:rPr>
+          <w:rFonts w:cs="Times New Roman"/>
+        </w:rPr>
+        <w:t>The domain is dental diagnostic decision support for common tooth pain and gum symptoms across age groups, using reported symptoms, affected tooth type and explicitly supplied dental examination findings. The supported targets are dental caries, reversible pulpitis, symptomatic irreversible pulpitis, gingivitis and periodontitis.</w:t>
       </w:r>
     </w:p>
     <w:p>
@@ -530,15 +885,12 @@
         <w:spacing w:line="360" w:lineRule="auto"/>
         <w:ind w:firstLine="720"/>
         <w:jc w:val="both"/>
-        <w:rPr>
-          <w:rFonts w:cs="Times New Roman"/>
-        </w:rPr>
-      </w:pPr>
-      <w:r>
-        <w:rPr>
-          <w:rFonts w:cs="Times New Roman"/>
-        </w:rPr>
-        <w:t>Dental symptoms can overlap, while a condition such as early caries may be present without reported pain [1]. A useful consultation therefore needs both symptom information and objective findings. DentalExplain keeps these groups separate and retains basic caries and periodontal observations even when the user reports no pain or gum symptoms.</w:t>
+      </w:pPr>
+      <w:r>
+        <w:rPr>
+          <w:rFonts w:cs="Times New Roman"/>
+        </w:rPr>
+        <w:t>Age is selected as 0-5, 6-12, 13-17, 18-64 or 65-120 years. These are consultation context groups, not diagnostic thresholds. Affected tooth type and root maturity are supplied independently; the engine does not infer them from age.</w:t>
       </w:r>
     </w:p>
     <w:p>
@@ -548,7 +900,7 @@
         <w:spacing w:before="220" w:after="140"/>
       </w:pPr>
       <w:r>
-        <w:t>1.2 Problem statement</w:t>
+        <w:t>2.2 Included scope</w:t>
       </w:r>
     </w:p>
     <w:p>
@@ -561,7 +913,7 @@
         <w:rPr>
           <w:rFonts w:cs="Times New Roman"/>
         </w:rPr>
-        <w:t>The problem addressed is how to provide a consistent, runnable expert-system consultation for five common dental conditions without ambiguous free-text inputs or an unnecessarily long questionnaire. The system must preserve uncertainty, identify missing or conflicting information, and evaluate evidence without requiring the user to select a diagnosis in advance.</w:t>
+        <w:t>The consultation collects two setup fields, reported pain and gum symptoms, warning signs, caries observations, relevant pulp/apical findings and periodontal measurements. Pulpal branches distinguish supplied primary, immature permanent and mature permanent tooth findings. Periodontal rules use attachment-loss patterns and exclusion of other local causes [2-6].</w:t>
       </w:r>
     </w:p>
     <w:p>
@@ -574,7 +926,30 @@
         <w:rPr>
           <w:rFonts w:cs="Times New Roman"/>
         </w:rPr>
-        <w:t>DentalExplain addresses this problem through a shared Prolog question catalogue, adaptive routing and forward fixed-point reasoning. Its outputs are supported candidates and assessment statuses. It does not make an autonomous clinical diagnosis. The intended user is a dentist who enters findings obtained and interpreted outside the application.</w:t>
+        <w:t>The system supports multiple candidates where their premises coexist. It can return missing-input requests, input conflicts, invalid-input status, an outside-scope response or no supported conclusion. A read-only workspace exposes the separate question, fact and rule catalogues.</w:t>
+      </w:r>
+    </w:p>
+    <w:p>
+      <w:pPr>
+        <w:pStyle w:val="Heading2"/>
+        <w:keepNext/>
+        <w:spacing w:before="220" w:after="140"/>
+      </w:pPr>
+      <w:r>
+        <w:t>2.3 Excluded scope</w:t>
+      </w:r>
+    </w:p>
+    <w:p>
+      <w:pPr>
+        <w:spacing w:line="360" w:lineRule="auto"/>
+        <w:ind w:firstLine="720"/>
+        <w:jc w:val="both"/>
+      </w:pPr>
+      <w:r>
+        <w:rPr>
+          <w:rFonts w:cs="Times New Roman"/>
+        </w:rPr>
+        <w:t>Orthodontic planning, oral cancer diagnosis, treatment prescribing, image interpretation, patient-record persistence, result export and knowledge editing are excluded. Facial swelling, drainage or fever leads to the existing outside-scope response rather than a diagnosis within this five-condition catalogue. A full dental differential diagnosis and periodontal staging/grading are not implemented.</w:t>
       </w:r>
     </w:p>
     <w:p>
@@ -584,117 +959,12 @@
         <w:pageBreakBefore/>
         <w:spacing w:after="140"/>
       </w:pPr>
-      <w:r>
-        <w:lastRenderedPageBreak/>
-        <w:t>2 Domain Definition and Scope</w:t>
-      </w:r>
-    </w:p>
-    <w:p>
-      <w:pPr>
-        <w:pStyle w:val="Heading2"/>
-        <w:keepNext/>
-        <w:spacing w:before="220" w:after="140"/>
-      </w:pPr>
-      <w:r>
-        <w:t>2.1 Specific domain</w:t>
-      </w:r>
-    </w:p>
-    <w:p>
-      <w:pPr>
-        <w:spacing w:line="360" w:lineRule="auto"/>
-        <w:ind w:firstLine="720"/>
-        <w:jc w:val="both"/>
-      </w:pPr>
-      <w:r>
-        <w:rPr>
-          <w:rFonts w:cs="Times New Roman"/>
-        </w:rPr>
-        <w:t>The domain is dental diagnostic decision support for common tooth pain and gum symptoms across age groups, using reported symptoms, affected tooth type and explicitly supplied dental examination findings. The supported targets are dental caries, reversible pulpitis, symptomatic irreversible pulpitis, gingivitis and periodontitis.</w:t>
-      </w:r>
-    </w:p>
-    <w:p>
-      <w:pPr>
-        <w:spacing w:line="360" w:lineRule="auto"/>
-        <w:ind w:firstLine="720"/>
-        <w:jc w:val="both"/>
-      </w:pPr>
-      <w:r>
-        <w:rPr>
-          <w:rFonts w:cs="Times New Roman"/>
-        </w:rPr>
-        <w:t>Age is selected as 0-5, 6-12, 13-17, 18-64 or 65-120 years. These are consultation context groups, not diagnostic thresholds. Affected tooth type and root maturity are supplied independently; the engine does not infer them from age.</w:t>
-      </w:r>
-    </w:p>
-    <w:p>
-      <w:pPr>
-        <w:pStyle w:val="Heading2"/>
-        <w:keepNext/>
-        <w:spacing w:before="220" w:after="140"/>
-      </w:pPr>
-      <w:r>
-        <w:t>2.2 Included scope</w:t>
-      </w:r>
-    </w:p>
-    <w:p>
-      <w:pPr>
-        <w:spacing w:line="360" w:lineRule="auto"/>
-        <w:ind w:firstLine="720"/>
-        <w:jc w:val="both"/>
-      </w:pPr>
-      <w:r>
-        <w:rPr>
-          <w:rFonts w:cs="Times New Roman"/>
-        </w:rPr>
-        <w:t>The consultation collects two setup fields, reported pain and gum symptoms, warning signs, caries observations, relevant pulp/apical findings and periodontal measurements. Pulpal branches distinguish supplied primary, immature permanent and mature permanent tooth findings. Periodontal rules use attachment-loss patterns and exclusion of other local causes [2-6].</w:t>
-      </w:r>
-    </w:p>
-    <w:p>
-      <w:pPr>
-        <w:spacing w:line="360" w:lineRule="auto"/>
-        <w:ind w:firstLine="720"/>
-        <w:jc w:val="both"/>
-      </w:pPr>
-      <w:r>
-        <w:rPr>
-          <w:rFonts w:cs="Times New Roman"/>
-        </w:rPr>
-        <w:t>The system supports multiple candidates where their premises coexist. It can return missing-input requests, input conflicts, invalid-input status, an outside-scope response or no supported conclusion. A read-only workspace exposes the separate question, fact and rule catalogues.</w:t>
-      </w:r>
-    </w:p>
-    <w:p>
-      <w:pPr>
-        <w:pStyle w:val="Heading2"/>
-        <w:keepNext/>
-        <w:spacing w:before="220" w:after="140"/>
-      </w:pPr>
-      <w:r>
-        <w:t>2.3 Excluded scope</w:t>
-      </w:r>
-    </w:p>
-    <w:p>
-      <w:pPr>
-        <w:spacing w:line="360" w:lineRule="auto"/>
-        <w:ind w:firstLine="720"/>
-        <w:jc w:val="both"/>
-      </w:pPr>
-      <w:r>
-        <w:rPr>
-          <w:rFonts w:cs="Times New Roman"/>
-        </w:rPr>
-        <w:t>Orthodontic planning, oral cancer diagnosis, treatment prescribing, image interpretation, patient-record persistence, result export and knowledge editing are excluded. Facial swelling, drainage or fever leads to the existing outside-scope response rather than a diagnosis within this five-condition catalogue. A full dental differential diagnosis and periodontal staging/grading are not implemented.</w:t>
-      </w:r>
-    </w:p>
-    <w:p>
-      <w:pPr>
-        <w:pStyle w:val="Heading1"/>
-        <w:keepNext/>
-        <w:pageBreakBefore/>
-        <w:spacing w:after="140"/>
-      </w:pPr>
+      <w:bookmarkStart w:id="3" w:name="_TocDentalExplain3"/>
       <w:r>
         <w:lastRenderedPageBreak/>
         <w:t>3 Knowledge Acquisition</w:t>
       </w:r>
+      <w:bookmarkEnd w:id="3"/>
     </w:p>
     <w:p>
       <w:pPr>
@@ -895,10 +1165,12 @@
         <w:pageBreakBefore/>
         <w:spacing w:after="140"/>
       </w:pPr>
+      <w:bookmarkStart w:id="4" w:name="_TocDentalExplain4"/>
       <w:r>
         <w:lastRenderedPageBreak/>
         <w:t>4 Expert System Architecture</w:t>
       </w:r>
+      <w:bookmarkEnd w:id="4"/>
     </w:p>
     <w:p>
       <w:pPr>
@@ -1568,10 +1840,12 @@
         <w:pageBreakBefore/>
         <w:spacing w:after="140"/>
       </w:pPr>
+      <w:bookmarkStart w:id="5" w:name="_TocDentalExplain5"/>
       <w:r>
         <w:lastRenderedPageBreak/>
         <w:t>5 Knowledge Representation</w:t>
       </w:r>
+      <w:bookmarkEnd w:id="5"/>
     </w:p>
     <w:p>
       <w:pPr>
@@ -1810,10 +2084,12 @@
         <w:pageBreakBefore/>
         <w:spacing w:after="140"/>
       </w:pPr>
+      <w:bookmarkStart w:id="6" w:name="_TocDentalExplain6"/>
       <w:r>
         <w:lastRenderedPageBreak/>
         <w:t>6 Inference Method</w:t>
       </w:r>
+      <w:bookmarkEnd w:id="6"/>
     </w:p>
     <w:p>
       <w:pPr>
@@ -2499,10 +2775,12 @@
         <w:pageBreakBefore/>
         <w:spacing w:after="140"/>
       </w:pPr>
+      <w:bookmarkStart w:id="7" w:name="_TocDentalExplain7"/>
       <w:r>
         <w:lastRenderedPageBreak/>
         <w:t>7 System Design and Implementation</w:t>
       </w:r>
+      <w:bookmarkEnd w:id="7"/>
     </w:p>
     <w:p>
       <w:pPr>
@@ -3203,10 +3481,12 @@
         <w:pageBreakBefore/>
         <w:spacing w:after="140"/>
       </w:pPr>
+      <w:bookmarkStart w:id="8" w:name="_TocDentalExplain8"/>
       <w:r>
         <w:lastRenderedPageBreak/>
         <w:t>8 Testing and Evaluation</w:t>
       </w:r>
+      <w:bookmarkEnd w:id="8"/>
     </w:p>
     <w:p>
       <w:pPr>
@@ -4882,10 +5162,12 @@
         <w:pageBreakBefore/>
         <w:spacing w:after="140"/>
       </w:pPr>
+      <w:bookmarkStart w:id="9" w:name="_TocDentalExplain9"/>
       <w:r>
         <w:lastRenderedPageBreak/>
         <w:t>References</w:t>
       </w:r>
+      <w:bookmarkEnd w:id="9"/>
     </w:p>
     <w:p>
       <w:pPr>
@@ -5017,10 +5299,12 @@
         <w:pageBreakBefore/>
         <w:spacing w:after="140"/>
       </w:pPr>
+      <w:bookmarkStart w:id="10" w:name="_TocDentalExplain10"/>
       <w:r>
         <w:lastRenderedPageBreak/>
         <w:t>Appendix A User Manual</w:t>
       </w:r>
+      <w:bookmarkEnd w:id="10"/>
     </w:p>
     <w:p>
       <w:pPr>
@@ -5394,10 +5678,12 @@
         <w:pageBreakBefore/>
         <w:spacing w:after="140"/>
       </w:pPr>
+      <w:bookmarkStart w:id="11" w:name="_TocDentalExplain11"/>
       <w:r>
         <w:lastRenderedPageBreak/>
         <w:t>Appendix B Human Expert Questionnaire</w:t>
       </w:r>
+      <w:bookmarkEnd w:id="11"/>
     </w:p>
     <w:p>
       <w:pPr>
@@ -5609,10 +5895,12 @@
         <w:pageBreakBefore/>
         <w:spacing w:after="140"/>
       </w:pPr>
+      <w:bookmarkStart w:id="12" w:name="_TocDentalExplain12"/>
       <w:r>
         <w:lastRenderedPageBreak/>
         <w:t>Appendix C Knowledge Catalogue</w:t>
       </w:r>
+      <w:bookmarkEnd w:id="12"/>
     </w:p>
     <w:p>
       <w:pPr>
@@ -10436,6 +10724,39 @@
       <w:szCs w:val="19"/>
     </w:rPr>
   </w:style>
+  <w:style w:type="paragraph" w:styleId="TOCHeading">
+    <w:name w:val="TOC Heading"/>
+    <w:basedOn w:val="Normal"/>
+    <w:next w:val="Normal"/>
+    <w:uiPriority w:val="39"/>
+    <w:qFormat/>
+    <w:pPr>
+      <w:outlineLvl w:val="9"/>
+    </w:pPr>
+    <w:rPr>
+      <w:b/>
+      <w:bCs/>
+      <w:sz w:val="30"/>
+      <w:szCs w:val="30"/>
+    </w:rPr>
+  </w:style>
+  <w:style w:type="paragraph" w:styleId="TOC1">
+    <w:name w:val="toc 1"/>
+    <w:basedOn w:val="Normal"/>
+    <w:next w:val="Normal"/>
+    <w:uiPriority w:val="39"/>
+    <w:pPr>
+      <w:tabs>
+        <w:tab w:val="right" w:leader="dot" w:pos="9360"/>
+      </w:tabs>
+      <w:spacing w:after="155"/>
+    </w:pPr>
+    <w:rPr>
+      <w:rFonts w:ascii="Times New Roman" w:hAnsi="Times New Roman" w:eastAsia="Times New Roman" w:cs="Times New Roman"/>
+      <w:sz w:val="22"/>
+      <w:color w:val="000000"/>
+    </w:rPr>
+  </w:style>
 </w:styles>
 </file>
 

</xml_diff>